<commit_message>
[week04] 함태훈 검증 반영 v0.1: RI85 출력측 = output-v1+ring2+cover plate1(elbow 2.2677 kg), left yaw +z, 축 규약 안(§6), 보고서 · 로그 갱신
Co-Authored-By: Claude Opus 5.5 <noreply@anthropic.com>
Claude-Session: https://claude.ai/code/session_015MVFLpu6hAhyrX1HywEtmx
</commit_message>
<xml_diff>
--- a/members/park-jongjin/reports/학부생_주간활동보고서_4주차_박종진_22212289_20261015.docx
+++ b/members/park-jongjin/reports/학부생_주간활동보고서_4주차_박종진_22212289_20261015.docx
@@ -686,7 +686,7 @@
               <w:rPr>
                 <w:sz w:val="16"/>
               </w:rPr>
-              <w:t xml:space="preserve">STEP(10/13 수령) 최상위 38개를 OCCT로 읽어 부품 접촉(거리 0)으로 링크 판정 → 팔당 링크 4 + torso, RI85는 고정측 = 부모 · output-v1 = 자식. 출력 디스크 대칭축으로 관절 축 4개 추출, 체적 합 10.22 L(팀장 10.1 L). 발견: 팔당 RI85 4개 = </w:t>
+              <w:t xml:space="preserve">STEP(10/13 수령) 최상위 38개를 OCCT로 읽어 부품 접촉(거리 0)으로 링크 판정 → 팔당 링크 4 + torso, RI85는 고정측 = 부모 · output-v1 = 자식. 출력 디스크 대칭축으로 관절 축 4개 추출. 발견: 팔당 RI85 4개 = </w:t>
             </w:r>
             <w:r>
               <w:rPr>
@@ -1001,7 +1001,7 @@
               <w:rPr>
                 <w:sz w:val="16"/>
               </w:rPr>
-              <w:t>함태훈 결과 미수령 → STEP에서 B1 임시 메시(visual 2만 면 · collision convex hull)와 재질 가정 관성을 직접 생성. robot.xml → robot_actuated.xml → scene.xml 로드: nq 11 · nu 11 · 75.80 kg, 4자세 접촉 0. elbow_link 관성 OCCT vs trimesh 질량 0.11 % · 관성 ≤ 0.21 %.</w:t>
+              <w:t>함태훈 결과 미수령 → STEP에서 B1 임시 메시(visual 2만 면 · collision convex hull)와 재질 가정 관성을 직접 생성. robot.xml → robot_actuated.xml → scene.xml 로드: nq 11 · nu 11 · 75.80 kg, 4자세 접촉 0. 함태훈 검증 반영: 어깨 축 0.01° 일치, RI85 출력측 부품(ring2 · cover plate1) 통일 → elbow 2.268 kg 일치.</w:t>
             </w:r>
           </w:p>
         </w:tc>
@@ -1031,7 +1031,7 @@
               <w:rPr>
                 <w:sz w:val="16"/>
               </w:rPr>
-              <w:t>80 %</w:t>
+              <w:t>90 %</w:t>
             </w:r>
           </w:p>
           <w:p>
@@ -1043,7 +1043,7 @@
               <w:rPr>
                 <w:sz w:val="16"/>
               </w:rPr>
-              <w:t>(함태훈 값 대조)</w:t>
+              <w:t>(관성 한 벌 통합)</w:t>
             </w:r>
           </w:p>
         </w:tc>
@@ -1197,7 +1197,7 @@
                 <w:sz w:val="16"/>
                 <w:szCs w:val="18"/>
               </w:rPr>
-              <w:t xml:space="preserve">③ 메시 · 관성 — visual(세밀) / collision(convex hull) 분리: hull은 요크 사이를 채워 범위가 보수적(elbow 108°, 실제는 더 넓음). 관성 비교: OCCT(FreeCAD 커널) 2.1425 vs trimesh 2.1401 kg → 계산 오차보다 </w:t>
+              <w:t xml:space="preserve">③ 메시 · 관성 — visual(세밀) / collision(convex hull) 분리: hull은 요크 사이를 채워 범위가 보수적(elbow 108°, 실제는 더 넓음). 관성 비교: OCCT(FreeCAD 커널) 2.2677 vs trimesh 2.2630 kg(0.21 %) → 계산 오차보다 </w:t>
             </w:r>
             <w:r>
               <w:rPr>
@@ -1212,7 +1212,7 @@
                 <w:sz w:val="16"/>
                 <w:szCs w:val="18"/>
               </w:rPr>
-              <w:t>(BOM 대조)이 지배적. Windows 한글 경로는 STL도 assets로 넘겨야 로드(v0_mjio.py, 사용자 폴더에서 nq 11 확인).</w:t>
+              <w:t>(BOM 대조)이 지배적. 처음 함태훈 값과 0.1255 kg 차이 = 출력과 같이 도는 ring2 · cover plate1 누락이 원인. 한글 경로는 STL도 assets로 로드(v0_mjio.py).</w:t>
             </w:r>
           </w:p>
         </w:tc>
@@ -1361,7 +1361,7 @@
               <w:rPr>
                 <w:sz w:val="16"/>
               </w:rPr>
-              <w:t>CAD 팔이 RI85 4개(4-DOF)로 목표 6-DOF와 2축 차이 — 손목 추가 계획이 있는지, +z가 로봇 전방인지(좌 · 우 이름), 팔꿈치 영점 정의 유지 여부 (10/13 질의)</w:t>
+              <w:t>CAD 팔 4-DOF(목표 6-DOF) 공유 · +z 전방 여부 · 팔꿈치 영점 · 조립 이상 A1 전달 (10/13 질의) / 좌우 관절 축 +/− 규약: 거울(ICD 3.4) vs 같은 방향(G1) — B1 안은 거울 (assumptions §6)</w:t>
             </w:r>
           </w:p>
         </w:tc>
@@ -1419,7 +1419,7 @@
               <w:rPr>
                 <w:sz w:val="16"/>
               </w:rPr>
-              <w:t>RI85 사양(피크 · 정격 토크, 속도, 감속비, 로터 관성) ICD 요청서(b1/docs/icd/actuator-spec-request.md) 함태훈 검토 후 발송 / C3 평면 베이스 채택 회신 대기</w:t>
+              <w:t>RI85 사양 ICD 요청서 v0.1(함태훈 검토 반영: 출력축 반사관성 · 효율 · 백래시) 발송 / C3 평면 베이스 채택 회신 대기</w:t>
             </w:r>
           </w:p>
         </w:tc>

</xml_diff>

<commit_message>
[week04] 노트북 재현: 통합 v0(74.10 kg) 뷰어 캡처 → img/repro, 보고서 부록 C · log 갱신
Co-Authored-By: Claude Opus 5.5 <noreply@anthropic.com>
Claude-Session: https://claude.ai/code/session_015MVFLpu6hAhyrX1HywEtmx
</commit_message>
<xml_diff>
--- a/members/park-jongjin/reports/학부생_주간활동보고서_4주차_박종진_22212289_20261015.docx
+++ b/members/park-jongjin/reports/학부생_주간활동보고서_4주차_박종진_22212289_20261015.docx
@@ -1915,14 +1915,14 @@
         <w:rPr>
           <w:sz w:val="18"/>
         </w:rPr>
-        <w:t>C. 노트북 재현 (week04/img/repro/, 10/14 영점 재정의 후) — Windows · 한글 경로에서 v0_mjio.py → MuJoCo 뷰어: 새 영점 정지, elbow + = 전방 굽힘 확인 (재정의 전 10/13 캡처도 repro/에 보관)</w:t>
+        <w:t>C. 노트북 재현 (week04/img/repro/, 10/14 통합 v0) — Windows · 한글 경로에서 v0_mjio.py → MuJoCo 뷰어: 질량 74.10 kg(통합 모델) 로드, 영점 정지, elbow + = 전방 굽힘 · roll 외전 확인 (이전 10/13 · 10/14 v0.1 캡처도 repro/에 보관)</w:t>
       </w:r>
     </w:p>
     <w:p>
       <w:r>
         <w:drawing>
           <wp:inline xmlns:a="http://schemas.openxmlformats.org/drawingml/2006/main" xmlns:pic="http://schemas.openxmlformats.org/drawingml/2006/picture">
-            <wp:extent cx="5580000" cy="1736000"/>
+            <wp:extent cx="5760000" cy="2555867"/>
             <wp:docPr id="5" name="Picture 5"/>
             <wp:cNvGraphicFramePr>
               <a:graphicFrameLocks noChangeAspect="1"/>
@@ -1931,7 +1931,7 @@
               <a:graphicData uri="http://schemas.openxmlformats.org/drawingml/2006/picture">
                 <pic:pic>
                   <pic:nvPicPr>
-                    <pic:cNvPr id="0" name="20261014_laptop_viewer_v01_strip.png"/>
+                    <pic:cNvPr id="0" name="20261014_laptop_merged_strip.png"/>
                     <pic:cNvPicPr/>
                   </pic:nvPicPr>
                   <pic:blipFill>
@@ -1943,7 +1943,7 @@
                   <pic:spPr>
                     <a:xfrm>
                       <a:off x="0" y="0"/>
-                      <a:ext cx="5580000" cy="1736000"/>
+                      <a:ext cx="5760000" cy="2555867"/>
                     </a:xfrm>
                     <a:prstGeom prst="rect"/>
                   </pic:spPr>

</xml_diff>